<commit_message>
docs: define o escopo como sistema de rastreamento independente
- remove do escopo e do cronograma qualquer integração com outros
  sistemas de gestão; o sistema é independente (clientes cadastrados
  nele e número da nota informado pelo operador)
- replaneja as semanas 9 a 13: alertas de status, confirmação de
  entrega por parada, indicadores, login de operador e homologação
- atualiza a professora (Prof.ª Jessica Aline Karsten) e identifica o
  trabalho como 8º período, semestre final (2026/2)
- retira do repositório o portfólio da etapa anterior
</commit_message>
<xml_diff>
--- a/docs/Cronograma_Entregas_TCC.docx
+++ b/docs/Cronograma_Entregas_TCC.docx
@@ -58,7 +58,7 @@
           <w:sz w:val="32"/>
           <w:szCs w:val="32"/>
         </w:rPr>
-        <w:t xml:space="preserve">Módulo de Rastreamento em Tempo Real de Motoboys</w:t>
+        <w:t xml:space="preserve">Sistema de Rastreamento em Tempo Real de Motoboys</w:t>
       </w:r>
     </w:p>
     <w:p>
@@ -74,7 +74,7 @@
           <w:sz w:val="24"/>
           <w:szCs w:val="24"/>
         </w:rPr>
-        <w:t xml:space="preserve">Integrado ao ERP da Galvitech · Piloto na Radar Auto Peças</w:t>
+        <w:t xml:space="preserve">Desenvolvido pela Galvitech · Implantação na Radar Auto Peças</w:t>
       </w:r>
     </w:p>
     <w:p>
@@ -86,7 +86,7 @@
           <w:sz w:val="22"/>
           <w:szCs w:val="22"/>
         </w:rPr>
-        <w:t xml:space="preserve">Trabalho de Conclusão de Curso · PAC 8 (2026/2)</w:t>
+        <w:t xml:space="preserve">Trabalho de Conclusão de Curso · 8º período, semestre final (2026/2)</w:t>
       </w:r>
     </w:p>
     <w:p>
@@ -134,14 +134,14 @@
           <w:sz w:val="22"/>
           <w:szCs w:val="22"/>
         </w:rPr>
-        <w:t xml:space="preserve">Orientador: </w:t>
+        <w:t xml:space="preserve">Professora: </w:t>
       </w:r>
       <w:r>
         <w:rPr>
           <w:sz w:val="22"/>
           <w:szCs w:val="22"/>
         </w:rPr>
-        <w:t xml:space="preserve">Prof. Andrei Carniel</w:t>
+        <w:t xml:space="preserve">Prof.ª Jessica Aline Karsten</w:t>
       </w:r>
     </w:p>
     <w:p>
@@ -190,7 +190,7 @@
         <w:jc w:val="both"/>
       </w:pPr>
       <w:r>
-        <w:t xml:space="preserve">A Galvitech Ltda, de Jaraguá do Sul/SC, presta serviços de ERP para o setor de autopeças. Muitos de seus clientes dependem de entregas feitas por motoboys, mas o ERP não possui nenhum módulo para essa atividade: não há rastreamento em tempo real, nem cálculo de rotas otimizadas, nem registro estruturado das viagens. Na Radar Auto Peças, cliente escolhido como piloto, o despacho era feito de forma manual, com os motoboys informando por telefone ou WhatsApp.</w:t>
+        <w:t xml:space="preserve">A Radar Auto Peças, de Jaraguá do Sul/SC, faz grande parte das suas vendas com entrega por motoboy. Até então o despacho era manual: não havia rastreamento em tempo real dos entregadores, nem cálculo de rotas otimizadas, nem registro estruturado das viagens, e os motoboys informavam sua situação por telefone ou WhatsApp. A Galvitech Ltda, empresa de software de Jaraguá do Sul/SC, desenvolve o sistema de rastreamento para resolver esse problema.</w:t>
       </w:r>
     </w:p>
     <w:p>
@@ -207,7 +207,7 @@
         <w:jc w:val="both"/>
       </w:pPr>
       <w:r>
-        <w:t xml:space="preserve">Sem o módulo, a loja não consegue informar prazos confiáveis ao cliente final, tem dificuldade em alocar o motoboy mais próximo, não mantém histórico para avaliar desempenho e perde a rastreabilidade entre entregas e notas fiscais.</w:t>
+        <w:t xml:space="preserve">Sem o sistema, a loja não consegue informar prazos confiáveis ao cliente final, tem dificuldade em alocar o motoboy mais próximo, não mantém histórico para avaliar desempenho e perde a rastreabilidade entre entregas e notas fiscais.</w:t>
       </w:r>
     </w:p>
     <w:p>
@@ -227,7 +227,7 @@
           <w:i/>
           <w:iCs/>
         </w:rPr>
-        <w:t xml:space="preserve">em que medida um módulo de rastreamento em tempo real integrado ao ERP da Galvitech é capaz de suprir essa lacuna operacional e aumentar a eficiência na gestão de entregas por motoboys?</w:t>
+        <w:t xml:space="preserve">em que medida um sistema de rastreamento em tempo real de motoboys, construído com tecnologias abertas, é capaz de reduzir o tempo de planejamento de rotas e aumentar a eficiência e a rastreabilidade das entregas da Radar Auto Peças?</w:t>
       </w:r>
     </w:p>
     <w:p>
@@ -244,7 +244,7 @@
         <w:jc w:val="both"/>
       </w:pPr>
       <w:r>
-        <w:t xml:space="preserve">Um módulo web embarcado no ERP e construído apenas com tecnologias abertas, sem custo de licenciamento:</w:t>
+        <w:t xml:space="preserve">Um sistema web independente, instalado no computador da loja e construído apenas com tecnologias abertas, sem custo de licenciamento:</w:t>
       </w:r>
     </w:p>
     <w:p>
@@ -333,15 +333,7 @@
         <w:jc w:val="both"/>
       </w:pPr>
       <w:r>
-        <w:t xml:space="preserve">Os cinco submódulos são: (1) rastreamento GPS em tempo real, (2) gestão e otimização de rotas pela heurística do vizinho mais próximo, (3) cadastro de clientes, (4) histórico de viagens vinculado à nota fiscal com exportação Excel e (5) replay de trilha.</w:t>
-      </w:r>
-    </w:p>
-    <w:p>
-      <w:pPr>
-        <w:pStyle w:val="Heading2"/>
-      </w:pPr>
-      <w:r>
-        <w:t xml:space="preserve">1.4 Objetivos</w:t>
+        <w:t xml:space="preserve">As cinco funcionalidades principais são: (1) rastreamento GPS em tempo real, (2) gestão e otimização de rotas pela heurística do vizinho mais próximo, (3) cadastro de clientes, (4) histórico de viagens com o número da nota/pedido informado pelo operador e exportação Excel e (5) replay de trilha.</w:t>
       </w:r>
     </w:p>
     <w:p>
@@ -354,10 +346,34 @@
           <w:b/>
           <w:bCs/>
         </w:rPr>
+        <w:t xml:space="preserve">Escopo: </w:t>
+      </w:r>
+      <w:r>
+        <w:t xml:space="preserve">o trabalho abrange somente o sistema de rastreamento descrito acima. Ele funciona de forma independente e não depende nem se integra a outros sistemas de gestão da loja. Os clientes são cadastrados no próprio sistema e o número da nota é digitado pelo operador na saída da entrega.</w:t>
+      </w:r>
+    </w:p>
+    <w:p>
+      <w:pPr>
+        <w:pStyle w:val="Heading2"/>
+      </w:pPr>
+      <w:r>
+        <w:t xml:space="preserve">1.4 Objetivos</w:t>
+      </w:r>
+    </w:p>
+    <w:p>
+      <w:pPr>
+        <w:spacing w:after="120" w:line="276"/>
+        <w:jc w:val="both"/>
+      </w:pPr>
+      <w:r>
+        <w:rPr>
+          <w:b/>
+          <w:bCs/>
+        </w:rPr>
         <w:t xml:space="preserve">Geral: </w:t>
       </w:r>
       <w:r>
-        <w:t xml:space="preserve">desenvolver e avaliar um módulo de rastreamento em tempo real de motoboys integrado ao ERP da Galvitech.</w:t>
+        <w:t xml:space="preserve">desenvolver e avaliar um sistema de rastreamento em tempo real de motoboys para a Radar Auto Peças.</w:t>
       </w:r>
     </w:p>
     <w:p>
@@ -370,7 +386,7 @@
         <w:spacing w:after="60"/>
       </w:pPr>
       <w:r>
-        <w:t xml:space="preserve">Levantar requisitos funcionais e não funcionais com colaboradores e clientes.</w:t>
+        <w:t xml:space="preserve">Levantar requisitos funcionais e não funcionais com a equipe da loja e os motoboys.</w:t>
       </w:r>
     </w:p>
     <w:p>
@@ -383,7 +399,7 @@
         <w:spacing w:after="60"/>
       </w:pPr>
       <w:r>
-        <w:t xml:space="preserve">Projetar a arquitetura e a integração com o ERP.</w:t>
+        <w:t xml:space="preserve">Projetar a arquitetura do sistema e o modelo de dados.</w:t>
       </w:r>
     </w:p>
     <w:p>
@@ -396,7 +412,7 @@
         <w:spacing w:after="60"/>
       </w:pPr>
       <w:r>
-        <w:t xml:space="preserve">Implementar os submódulos de rastreamento, rotas, clientes, histórico e replay.</w:t>
+        <w:t xml:space="preserve">Implementar o rastreamento, as rotas, o cadastro de clientes, o histórico e o replay.</w:t>
       </w:r>
     </w:p>
     <w:p>
@@ -495,7 +511,7 @@
         <w:spacing w:after="60"/>
       </w:pPr>
       <w:r>
-        <w:t xml:space="preserve">a entrega foi demonstrada ao orientador ou à Galvitech, quando aplicável.</w:t>
+        <w:t xml:space="preserve">a entrega foi demonstrada à professora, quando aplicável.</w:t>
       </w:r>
     </w:p>
     <w:p>
@@ -510,7 +526,7 @@
         </w:rPr>
         <w:t xml:space="preserve">Repositório: </w:t>
       </w:r>
-      <w:hyperlink w:history="1" r:id="rIdcimktnqnwladam5z2cffh">
+      <w:hyperlink w:history="1" r:id="rIdy6oqbzkhzrky4_a2jvaa2">
         <w:r>
           <w:rPr>
             <w:rStyle w:val="Hyperlink"/>
@@ -938,7 +954,7 @@
                 <w:sz w:val="18"/>
                 <w:szCs w:val="18"/>
               </w:rPr>
-              <w:t xml:space="preserve">v0.8.0: módulo funcional, testado e documentado</w:t>
+              <w:t xml:space="preserve">v0.8.0: sistema funcional, testado e documentado</w:t>
             </w:r>
           </w:p>
         </w:tc>
@@ -1064,7 +1080,7 @@
                 <w:sz w:val="18"/>
                 <w:szCs w:val="18"/>
               </w:rPr>
-              <w:t xml:space="preserve">v0.9.0: integrado ao ERP e homologado</w:t>
+              <w:t xml:space="preserve">v0.9.0: rastreador homologado na Radar Auto Peças</w:t>
             </w:r>
           </w:p>
         </w:tc>
@@ -1376,7 +1392,7 @@
         <w:jc w:val="left"/>
       </w:pPr>
       <w:r>
-        <w:t xml:space="preserve">Resumo das 18 entregas do PAC 8. As linhas em verde já foram entregues.</w:t>
+        <w:t xml:space="preserve">Resumo das 18 entregas do semestre final. As linhas em verde já foram entregues.</w:t>
       </w:r>
     </w:p>
     <w:tbl>
@@ -3329,7 +3345,7 @@
                 <w:sz w:val="18"/>
                 <w:szCs w:val="18"/>
               </w:rPr>
-              <w:t xml:space="preserve">Clientes</w:t>
+              <w:t xml:space="preserve">Rastreamento GPS</w:t>
             </w:r>
           </w:p>
         </w:tc>
@@ -3361,7 +3377,7 @@
                 <w:sz w:val="18"/>
                 <w:szCs w:val="18"/>
               </w:rPr>
-              <w:t xml:space="preserve">Importação do cadastro de clientes do ERP da Galvitech.</w:t>
+              <w:t xml:space="preserve">Alertas de status do motoboy: sinal perdido, parado por muito tempo e bateria baixa.</w:t>
             </w:r>
           </w:p>
         </w:tc>
@@ -3526,7 +3542,7 @@
                 <w:sz w:val="18"/>
                 <w:szCs w:val="18"/>
               </w:rPr>
-              <w:t xml:space="preserve">Histórico</w:t>
+              <w:t xml:space="preserve">Entregas</w:t>
             </w:r>
           </w:p>
         </w:tc>
@@ -3558,7 +3574,7 @@
                 <w:sz w:val="18"/>
                 <w:szCs w:val="18"/>
               </w:rPr>
-              <w:t xml:space="preserve">Vínculo de cada viagem com a NF-e emitida no ERP.</w:t>
+              <w:t xml:space="preserve">Confirmação de entrega por parada, com horário de chegada em cada cliente.</w:t>
             </w:r>
           </w:p>
         </w:tc>
@@ -3920,7 +3936,7 @@
                 <w:sz w:val="18"/>
                 <w:szCs w:val="18"/>
               </w:rPr>
-              <w:t xml:space="preserve">Integração ERP</w:t>
+              <w:t xml:space="preserve">Segurança</w:t>
             </w:r>
           </w:p>
         </w:tc>
@@ -3952,7 +3968,7 @@
                 <w:sz w:val="18"/>
                 <w:szCs w:val="18"/>
               </w:rPr>
-              <w:t xml:space="preserve">Painel embarcado no ERP com login de operador.</w:t>
+              <w:t xml:space="preserve">Login de operador no painel e perfis de acesso.</w:t>
             </w:r>
           </w:p>
         </w:tc>
@@ -4149,7 +4165,7 @@
                 <w:sz w:val="18"/>
                 <w:szCs w:val="18"/>
               </w:rPr>
-              <w:t xml:space="preserve">Testes de integração e homologação na Radar Auto Peças.</w:t>
+              <w:t xml:space="preserve">Testes de campo e homologação do rastreador na Radar Auto Peças.</w:t>
             </w:r>
           </w:p>
         </w:tc>
@@ -4543,7 +4559,7 @@
                 <w:sz w:val="18"/>
                 <w:szCs w:val="18"/>
               </w:rPr>
-              <w:t xml:space="preserve">Piloto em ambiente real com cronometragem usando o módulo.</w:t>
+              <w:t xml:space="preserve">Piloto em ambiente real com cronometragem usando o sistema.</w:t>
             </w:r>
           </w:p>
         </w:tc>
@@ -5382,7 +5398,7 @@
         <w:spacing w:after="60"/>
       </w:pPr>
       <w:r>
-        <w:t xml:space="preserve">Priorização dos submódulos</w:t>
+        <w:t xml:space="preserve">Priorização das funcionalidades</w:t>
       </w:r>
     </w:p>
     <w:p>
@@ -5998,7 +6014,7 @@
         <w:keepNext/>
       </w:pPr>
       <w:r>
-        <w:t xml:space="preserve">Semana 09 · 02/10/2026 · Clientes</w:t>
+        <w:t xml:space="preserve">Semana 09 · 02/10/2026 · Rastreamento GPS</w:t>
       </w:r>
     </w:p>
     <w:p>
@@ -6015,7 +6031,7 @@
         <w:t xml:space="preserve">Entrega: </w:t>
       </w:r>
       <w:r>
-        <w:t xml:space="preserve">Importação do cadastro de clientes do ERP da Galvitech.</w:t>
+        <w:t xml:space="preserve">Alertas de status do motoboy: sinal perdido, parado por muito tempo e bateria baixa.</w:t>
       </w:r>
     </w:p>
     <w:p>
@@ -6028,7 +6044,7 @@
         <w:spacing w:after="60"/>
       </w:pPr>
       <w:r>
-        <w:t xml:space="preserve">Mapear a tabela de clientes do ERP</w:t>
+        <w:t xml:space="preserve">Detectar motoboy sem sinal (última posição antiga)</w:t>
       </w:r>
     </w:p>
     <w:p>
@@ -6041,7 +6057,7 @@
         <w:spacing w:after="60"/>
       </w:pPr>
       <w:r>
-        <w:t xml:space="preserve">Importação (CSV/consulta) com geocodificação dos endereços</w:t>
+        <w:t xml:space="preserve">Alerta de parada prolongada fora de um cliente</w:t>
       </w:r>
     </w:p>
     <w:p>
@@ -6054,7 +6070,7 @@
         <w:spacing w:after="60"/>
       </w:pPr>
       <w:r>
-        <w:t xml:space="preserve">Tratamento de clientes sem coordenadas</w:t>
+        <w:t xml:space="preserve">Nível de bateria enviado pelo OwnTracks (campo batt)</w:t>
       </w:r>
     </w:p>
     <w:p>
@@ -6094,7 +6110,7 @@
         <w:keepNext/>
       </w:pPr>
       <w:r>
-        <w:t xml:space="preserve">Semana 10 · 09/10/2026 · Histórico</w:t>
+        <w:t xml:space="preserve">Semana 10 · 09/10/2026 · Entregas</w:t>
       </w:r>
     </w:p>
     <w:p>
@@ -6111,7 +6127,7 @@
         <w:t xml:space="preserve">Entrega: </w:t>
       </w:r>
       <w:r>
-        <w:t xml:space="preserve">Vínculo de cada viagem com a NF-e emitida no ERP.</w:t>
+        <w:t xml:space="preserve">Confirmação de entrega por parada, com horário de chegada em cada cliente.</w:t>
       </w:r>
     </w:p>
     <w:p>
@@ -6124,7 +6140,7 @@
         <w:spacing w:after="60"/>
       </w:pPr>
       <w:r>
-        <w:t xml:space="preserve">Consulta da NF-e pelo número informado</w:t>
+        <w:t xml:space="preserve">Marcar cada parada como entregue no painel</w:t>
       </w:r>
     </w:p>
     <w:p>
@@ -6137,7 +6153,7 @@
         <w:spacing w:after="60"/>
       </w:pPr>
       <w:r>
-        <w:t xml:space="preserve">Validação da nota antes da saída</w:t>
+        <w:t xml:space="preserve">Registrar o horário de chegada por cliente</w:t>
       </w:r>
     </w:p>
     <w:p>
@@ -6150,7 +6166,7 @@
         <w:spacing w:after="60"/>
       </w:pPr>
       <w:r>
-        <w:t xml:space="preserve">Histórico com cliente e valor da nota</w:t>
+        <w:t xml:space="preserve">Histórico detalhado por parada</w:t>
       </w:r>
     </w:p>
     <w:p>
@@ -6220,7 +6236,7 @@
         <w:spacing w:after="60"/>
       </w:pPr>
       <w:r>
-        <w:t xml:space="preserve">Entregas por motoboy e tempo médio de rota</w:t>
+        <w:t xml:space="preserve">Entregas por motoboy, tempo médio de rota e km rodados</w:t>
       </w:r>
     </w:p>
     <w:p>
@@ -6286,7 +6302,7 @@
         <w:keepNext/>
       </w:pPr>
       <w:r>
-        <w:t xml:space="preserve">Semana 12 · 23/10/2026 · Integração ERP</w:t>
+        <w:t xml:space="preserve">Semana 12 · 23/10/2026 · Segurança</w:t>
       </w:r>
     </w:p>
     <w:p>
@@ -6303,7 +6319,7 @@
         <w:t xml:space="preserve">Entrega: </w:t>
       </w:r>
       <w:r>
-        <w:t xml:space="preserve">Painel embarcado no ERP com login de operador.</w:t>
+        <w:t xml:space="preserve">Login de operador no painel e perfis de acesso.</w:t>
       </w:r>
     </w:p>
     <w:p>
@@ -6316,7 +6332,7 @@
         <w:spacing w:after="60"/>
       </w:pPr>
       <w:r>
-        <w:t xml:space="preserve">Autenticação com usuários do ERP</w:t>
+        <w:t xml:space="preserve">Autenticação de usuários do painel</w:t>
       </w:r>
     </w:p>
     <w:p>
@@ -6329,7 +6345,7 @@
         <w:spacing w:after="60"/>
       </w:pPr>
       <w:r>
-        <w:t xml:space="preserve">Incorporação do painel na interface do ERP</w:t>
+        <w:t xml:space="preserve">Perfis de acesso (operador / gestor)</w:t>
       </w:r>
     </w:p>
     <w:p>
@@ -6342,7 +6358,7 @@
         <w:spacing w:after="60"/>
       </w:pPr>
       <w:r>
-        <w:t xml:space="preserve">Perfis de acesso (operador / gestor)</w:t>
+        <w:t xml:space="preserve">Proteção das rotas da API e acesso externo via HTTPS</w:t>
       </w:r>
     </w:p>
     <w:p>
@@ -6399,7 +6415,7 @@
         <w:t xml:space="preserve">Entrega: </w:t>
       </w:r>
       <w:r>
-        <w:t xml:space="preserve">Testes de integração e homologação na Radar Auto Peças.</w:t>
+        <w:t xml:space="preserve">Testes de campo e homologação do rastreador na Radar Auto Peças.</w:t>
       </w:r>
     </w:p>
     <w:p>
@@ -6412,7 +6428,7 @@
         <w:spacing w:after="60"/>
       </w:pPr>
       <w:r>
-        <w:t xml:space="preserve">Testes de integração ERP ↔ módulo</w:t>
+        <w:t xml:space="preserve">Testes de campo com os motoboys</w:t>
       </w:r>
     </w:p>
     <w:p>
@@ -6425,7 +6441,7 @@
         <w:spacing w:after="60"/>
       </w:pPr>
       <w:r>
-        <w:t xml:space="preserve">Homologação com o operador</w:t>
+        <w:t xml:space="preserve">Homologação com o operador de expedição</w:t>
       </w:r>
     </w:p>
     <w:p>
@@ -6508,7 +6524,7 @@
         <w:spacing w:after="60"/>
       </w:pPr>
       <w:r>
-        <w:t xml:space="preserve">Medir o tempo de planejamento de rotas sem o módulo</w:t>
+        <w:t xml:space="preserve">Medir o tempo de planejamento de rotas sem o sistema</w:t>
       </w:r>
     </w:p>
     <w:p>
@@ -6591,7 +6607,7 @@
         <w:t xml:space="preserve">Entrega: </w:t>
       </w:r>
       <w:r>
-        <w:t xml:space="preserve">Piloto em ambiente real com cronometragem usando o módulo.</w:t>
+        <w:t xml:space="preserve">Piloto em ambiente real com cronometragem usando o sistema.</w:t>
       </w:r>
     </w:p>
     <w:p>
@@ -6617,7 +6633,7 @@
         <w:spacing w:after="60"/>
       </w:pPr>
       <w:r>
-        <w:t xml:space="preserve">Medir o tempo de planejamento com o módulo</w:t>
+        <w:t xml:space="preserve">Medir o tempo de planejamento com o sistema</w:t>
       </w:r>
     </w:p>
     <w:p>
@@ -6892,7 +6908,7 @@
         <w:spacing w:after="60"/>
       </w:pPr>
       <w:r>
-        <w:t xml:space="preserve">Revisão com o orientador</w:t>
+        <w:t xml:space="preserve">Revisão com a professora</w:t>
       </w:r>
     </w:p>
     <w:p>
@@ -6966,7 +6982,7 @@
         <w:jc w:val="both"/>
       </w:pPr>
       <w:r>
-        <w:t xml:space="preserve">O repositório contém o módulo funcional, testado e documentado, pronto para rodar em qualquer computador com Python 3.10 ou superior:</w:t>
+        <w:t xml:space="preserve">O repositório contém o sistema funcional, testado e documentado, pronto para rodar em qualquer computador com Python 3.10 ou superior:</w:t>
       </w:r>
     </w:p>
     <w:p>
@@ -7501,7 +7517,7 @@
                 <w:sz w:val="18"/>
                 <w:szCs w:val="18"/>
               </w:rPr>
-              <w:t xml:space="preserve">Acesso ao banco do ERP legado</w:t>
+              <w:t xml:space="preserve">Queda de internet ou do computador da loja</w:t>
             </w:r>
           </w:p>
         </w:tc>
@@ -7561,7 +7577,7 @@
                 <w:sz w:val="18"/>
                 <w:szCs w:val="18"/>
               </w:rPr>
-              <w:t xml:space="preserve">Camada db.py isolada; importação via CSV como alternativa à consulta direta.</w:t>
+              <w:t xml:space="preserve">Sessão gravada em disco e retomada no reinício; modo offline de rotas; backup da pasta data/.</w:t>
             </w:r>
           </w:p>
         </w:tc>
@@ -7902,7 +7918,7 @@
         <w:spacing w:after="60"/>
       </w:pPr>
       <w:r>
-        <w:t xml:space="preserve">Rastreabilidade ponta a ponta de cada entrega, vinculada à nota fiscal.</w:t>
+        <w:t xml:space="preserve">Rastreabilidade de cada entrega, com o número da nota/pedido registrado no histórico.</w:t>
       </w:r>
     </w:p>
     <w:p>
@@ -7928,7 +7944,7 @@
         <w:spacing w:after="60"/>
       </w:pPr>
       <w:r>
-        <w:t xml:space="preserve">Aumento do valor competitivo do ERP da Galvitech frente a plataformas SaaS de terceiros.</w:t>
+        <w:t xml:space="preserve">Alternativa sem mensalidade às plataformas SaaS de entrega, hospedada na própria loja.</w:t>
       </w:r>
     </w:p>
     <w:p>

</xml_diff>

<commit_message>
docs: registra a entrega da semana 9 no cronograma
Semana 9 marcada como concluída no Word e no Markdown. A capa e a
seção de situação atual passam a refletir automaticamente a última
entrega concluída.
</commit_message>
<xml_diff>
--- a/docs/Cronograma_Entregas_TCC.docx
+++ b/docs/Cronograma_Entregas_TCC.docx
@@ -155,7 +155,7 @@
           <w:sz w:val="20"/>
           <w:szCs w:val="20"/>
         </w:rPr>
-        <w:t xml:space="preserve">Jaraguá do Sul/SC · Versão do documento: 25/09/2026 (entrega da semana 8)</w:t>
+        <w:t xml:space="preserve">Jaraguá do Sul/SC · Versão do documento: 02/10/2026 (entrega da semana 9)</w:t>
       </w:r>
     </w:p>
     <w:p>
@@ -526,7 +526,7 @@
         </w:rPr>
         <w:t xml:space="preserve">Repositório: </w:t>
       </w:r>
-      <w:hyperlink w:history="1" r:id="rIdy6oqbzkhzrky4_a2jvaa2">
+      <w:hyperlink w:history="1" r:id="rIdii9umango_vfhq4xsqtfh">
         <w:r>
           <w:rPr>
             <w:rStyle w:val="Hyperlink"/>
@@ -3262,6 +3262,7 @@
               <w:bottom w:val="single" w:color="BFBFBF" w:sz="4"/>
               <w:right w:val="single" w:color="BFBFBF" w:sz="4"/>
             </w:tcBorders>
+            <w:shd w:fill="E2EFD9" w:color="auto" w:val="clear"/>
             <w:tcMar>
               <w:top w:type="dxa" w:w="60"/>
               <w:left w:type="dxa" w:w="90"/>
@@ -3294,6 +3295,7 @@
               <w:bottom w:val="single" w:color="BFBFBF" w:sz="4"/>
               <w:right w:val="single" w:color="BFBFBF" w:sz="4"/>
             </w:tcBorders>
+            <w:shd w:fill="E2EFD9" w:color="auto" w:val="clear"/>
             <w:tcMar>
               <w:top w:type="dxa" w:w="60"/>
               <w:left w:type="dxa" w:w="90"/>
@@ -3326,6 +3328,7 @@
               <w:bottom w:val="single" w:color="BFBFBF" w:sz="4"/>
               <w:right w:val="single" w:color="BFBFBF" w:sz="4"/>
             </w:tcBorders>
+            <w:shd w:fill="E2EFD9" w:color="auto" w:val="clear"/>
             <w:tcMar>
               <w:top w:type="dxa" w:w="60"/>
               <w:left w:type="dxa" w:w="90"/>
@@ -3358,6 +3361,7 @@
               <w:bottom w:val="single" w:color="BFBFBF" w:sz="4"/>
               <w:right w:val="single" w:color="BFBFBF" w:sz="4"/>
             </w:tcBorders>
+            <w:shd w:fill="E2EFD9" w:color="auto" w:val="clear"/>
             <w:tcMar>
               <w:top w:type="dxa" w:w="60"/>
               <w:left w:type="dxa" w:w="90"/>
@@ -3390,6 +3394,7 @@
               <w:bottom w:val="single" w:color="BFBFBF" w:sz="4"/>
               <w:right w:val="single" w:color="BFBFBF" w:sz="4"/>
             </w:tcBorders>
+            <w:shd w:fill="E2EFD9" w:color="auto" w:val="clear"/>
             <w:tcMar>
               <w:top w:type="dxa" w:w="60"/>
               <w:left w:type="dxa" w:w="90"/>
@@ -3409,7 +3414,7 @@
                 <w:sz w:val="18"/>
                 <w:szCs w:val="18"/>
               </w:rPr>
-              <w:t xml:space="preserve">Milestone "Semana 09" no GitHub</w:t>
+              <w:t xml:space="preserve">alertas.py + issues #31–#33 fechadas</w:t>
             </w:r>
           </w:p>
         </w:tc>
@@ -3422,26 +3427,27 @@
               <w:bottom w:val="single" w:color="BFBFBF" w:sz="4"/>
               <w:right w:val="single" w:color="BFBFBF" w:sz="4"/>
             </w:tcBorders>
-            <w:tcMar>
-              <w:top w:type="dxa" w:w="60"/>
-              <w:left w:type="dxa" w:w="90"/>
-              <w:bottom w:type="dxa" w:w="60"/>
-              <w:right w:type="dxa" w:w="90"/>
-            </w:tcMar>
-            <w:vAlign w:val="center"/>
-          </w:tcPr>
-          <w:p>
-            <w:pPr>
-              <w:jc w:val="center"/>
-            </w:pPr>
-            <w:r>
-              <w:rPr>
-                <w:b w:val="false"/>
-                <w:bCs w:val="false"/>
-                <w:sz w:val="18"/>
-                <w:szCs w:val="18"/>
-              </w:rPr>
-              <w:t xml:space="preserve">Planejada</w:t>
+            <w:shd w:fill="E2EFD9" w:color="auto" w:val="clear"/>
+            <w:tcMar>
+              <w:top w:type="dxa" w:w="60"/>
+              <w:left w:type="dxa" w:w="90"/>
+              <w:bottom w:type="dxa" w:w="60"/>
+              <w:right w:type="dxa" w:w="90"/>
+            </w:tcMar>
+            <w:vAlign w:val="center"/>
+          </w:tcPr>
+          <w:p>
+            <w:pPr>
+              <w:jc w:val="center"/>
+            </w:pPr>
+            <w:r>
+              <w:rPr>
+                <w:b w:val="false"/>
+                <w:bCs w:val="false"/>
+                <w:sz w:val="18"/>
+                <w:szCs w:val="18"/>
+              </w:rPr>
+              <w:t xml:space="preserve">Concluída</w:t>
             </w:r>
           </w:p>
         </w:tc>
@@ -6086,7 +6092,7 @@
         <w:t xml:space="preserve">Evidência: </w:t>
       </w:r>
       <w:r>
-        <w:t xml:space="preserve">Milestone "Semana 09" no GitHub</w:t>
+        <w:t xml:space="preserve">alertas.py + issues #31–#33 fechadas</w:t>
       </w:r>
       <w:r>
         <w:rPr>
@@ -6099,9 +6105,9 @@
         <w:rPr>
           <w:b/>
           <w:bCs/>
-          <w:color w:val="B45F06"/>
-        </w:rPr>
-        <w:t xml:space="preserve">Planejada</w:t>
+          <w:color w:val="38761D"/>
+        </w:rPr>
+        <w:t xml:space="preserve">Concluída</w:t>
       </w:r>
     </w:p>
     <w:p>
@@ -6973,7 +6979,7 @@
         <w:pStyle w:val="Heading1"/>
       </w:pPr>
       <w:r>
-        <w:t xml:space="preserve">6. Situação atual (entrega da semana 8, versão 0.8.0)</w:t>
+        <w:t xml:space="preserve">6. Situação atual (entrega da semana 9, 02/10/2026)</w:t>
       </w:r>
     </w:p>
     <w:p>
@@ -7059,10 +7065,30 @@
           <w:b/>
           <w:bCs/>
         </w:rPr>
+        <w:t xml:space="preserve">Alertas de status (semana 9): </w:t>
+      </w:r>
+      <w:r>
+        <w:t xml:space="preserve">o painel avisa quando o motoboy fica sem sinal, parado mais de 10 min fora de um cliente ou com a bateria do celular abaixo de 20%.</w:t>
+      </w:r>
+    </w:p>
+    <w:p>
+      <w:pPr>
+        <w:pStyle w:val="ListParagraph"/>
+        <w:numPr>
+          <w:ilvl w:val="0"/>
+          <w:numId w:val="2"/>
+        </w:numPr>
+        <w:spacing w:after="60"/>
+      </w:pPr>
+      <w:r>
+        <w:rPr>
+          <w:b/>
+          <w:bCs/>
+        </w:rPr>
         <w:t xml:space="preserve">Qualidade: </w:t>
       </w:r>
       <w:r>
-        <w:t xml:space="preserve">29 testes automatizados e integração contínua em Windows e Ubuntu.</w:t>
+        <w:t xml:space="preserve">43 testes automatizados e integração contínua em Windows e Ubuntu.</w:t>
       </w:r>
     </w:p>
     <w:p>

</xml_diff>